<commit_message>
Small changes for VFR Phraseology
</commit_message>
<xml_diff>
--- a/VFR/VFR phraseology.docx
+++ b/VFR/VFR phraseology.docx
@@ -75,7 +75,7 @@
           <w:sz w:val="28"/>
           <w:szCs w:val="28"/>
         </w:rPr>
-        <w:t>2</w:t>
+        <w:t>3</w:t>
       </w:r>
     </w:p>
     <w:p>
@@ -1926,204 +1926,166 @@
           <w:i/>
           <w:iCs/>
         </w:rPr>
-        <w:t>Left - 27</w:t>
-      </w:r>
-      <w:r>
-        <w:rPr>
+        <w:t>Right</w:t>
+      </w:r>
+      <w:r>
+        <w:rPr>
+          <w:b/>
+          <w:bCs/>
           <w:i/>
           <w:iCs/>
         </w:rPr>
-        <w:t xml:space="preserve"> and </w:t>
-      </w:r>
-      <w:r>
-        <w:rPr>
-          <w:b/>
-          <w:bCs/>
+        <w:t xml:space="preserve"> - 27</w:t>
+      </w:r>
+      <w:r>
+        <w:rPr>
           <w:i/>
           <w:iCs/>
         </w:rPr>
-        <w:t>Right - 09</w:t>
-      </w:r>
-      <w:r>
-        <w:rPr>
+        <w:t xml:space="preserve"> and </w:t>
+      </w:r>
+      <w:r>
+        <w:rPr>
+          <w:b/>
+          <w:bCs/>
           <w:i/>
           <w:iCs/>
         </w:rPr>
-        <w:t>).</w:t>
-      </w:r>
-    </w:p>
-    <w:p>
-      <w:pPr>
-        <w:pStyle w:val="Header1"/>
-      </w:pPr>
-      <w:bookmarkStart w:id="0" w:name="_Toc168934051"/>
-      <w:r>
-        <w:t>Traffic pattern</w:t>
-      </w:r>
-      <w:bookmarkEnd w:id="0"/>
-    </w:p>
-    <w:p>
-      <w:pPr>
-        <w:pStyle w:val="Header2"/>
-      </w:pPr>
-      <w:bookmarkStart w:id="1" w:name="_Toc168934052"/>
-      <w:r>
-        <w:t>Ground procedures</w:t>
-      </w:r>
-      <w:bookmarkEnd w:id="1"/>
-    </w:p>
-    <w:p>
-      <w:pPr>
-        <w:pStyle w:val="Header3"/>
-      </w:pPr>
-      <w:bookmarkStart w:id="2" w:name="_Toc168934053"/>
-      <w:r>
-        <w:t>Departure clearance</w:t>
-      </w:r>
-      <w:bookmarkEnd w:id="2"/>
-    </w:p>
-    <w:p>
-      <w:pPr>
-        <w:pStyle w:val="Pilot"/>
-      </w:pPr>
-      <w:r>
-        <w:rPr>
-          <w:b/>
-          <w:bCs/>
-        </w:rPr>
-        <w:t>Pilot:</w:t>
-      </w:r>
-      <w:r>
-        <w:t xml:space="preserve"> Sofia Tower, LZBKGE with information </w:t>
-      </w:r>
-      <w:r>
-        <w:t>[</w:t>
-      </w:r>
-      <w:proofErr w:type="spellStart"/>
-      <w:r>
-        <w:t>ATIS_information</w:t>
-      </w:r>
-      <w:proofErr w:type="spellEnd"/>
-      <w:r>
-        <w:t>]</w:t>
-      </w:r>
-      <w:r>
-        <w:t xml:space="preserve"> on board, requesting VFR flight for traffic circuits.</w:t>
-      </w:r>
-    </w:p>
-    <w:p>
-      <w:pPr>
-        <w:pStyle w:val="ATC"/>
-      </w:pPr>
-      <w:r>
-        <w:rPr>
-          <w:b/>
-          <w:bCs/>
-        </w:rPr>
-        <w:t>ATC:</w:t>
-      </w:r>
-      <w:r>
-        <w:t xml:space="preserve"> LZBKGE, cleared for [*] traffic pattern, runway [</w:t>
-      </w:r>
-      <w:proofErr w:type="spellStart"/>
-      <w:r>
-        <w:t>active_runway</w:t>
-      </w:r>
-      <w:proofErr w:type="spellEnd"/>
-      <w:r>
-        <w:t>], not above altitude [</w:t>
-      </w:r>
-      <w:proofErr w:type="spellStart"/>
-      <w:r>
-        <w:t>pattern_altitude</w:t>
-      </w:r>
-      <w:proofErr w:type="spellEnd"/>
-      <w:r>
-        <w:t>] feet, squawk [</w:t>
-      </w:r>
-      <w:proofErr w:type="spellStart"/>
-      <w:r>
-        <w:t>assigned_squawk</w:t>
-      </w:r>
-      <w:proofErr w:type="spellEnd"/>
-      <w:r>
-        <w:t>]</w:t>
-      </w:r>
-    </w:p>
-    <w:p>
-      <w:pPr>
-        <w:pStyle w:val="Pilot"/>
-      </w:pPr>
-      <w:r>
-        <w:rPr>
-          <w:b/>
-          <w:bCs/>
-        </w:rPr>
-        <w:t>Pilot:</w:t>
-      </w:r>
-      <w:r>
-        <w:t xml:space="preserve"> Cleared for [*] traffic pattern, runway [</w:t>
-      </w:r>
-      <w:proofErr w:type="spellStart"/>
-      <w:r>
-        <w:t>active_runway</w:t>
-      </w:r>
-      <w:proofErr w:type="spellEnd"/>
-      <w:r>
-        <w:t>], not above altitude [</w:t>
-      </w:r>
-      <w:proofErr w:type="spellStart"/>
-      <w:r>
-        <w:t>pattern_altitude</w:t>
-      </w:r>
-      <w:proofErr w:type="spellEnd"/>
-      <w:r>
-        <w:t>], squawk [</w:t>
-      </w:r>
-      <w:proofErr w:type="spellStart"/>
-      <w:r>
-        <w:t>assigned_squawk</w:t>
-      </w:r>
-      <w:proofErr w:type="spellEnd"/>
-      <w:r>
-        <w:t>], LZBKGE.</w:t>
-      </w:r>
-    </w:p>
-    <w:p>
-      <w:pPr>
-        <w:pStyle w:val="ATC"/>
-      </w:pPr>
-      <w:r>
-        <w:rPr>
-          <w:b/>
-          <w:bCs/>
-        </w:rPr>
-        <w:t>ATC</w:t>
-      </w:r>
-      <w:r>
-        <w:rPr>
-          <w:b/>
-          <w:bCs/>
-        </w:rPr>
-        <w:t>:</w:t>
-      </w:r>
-      <w:r>
-        <w:t xml:space="preserve"> LZBKGE, readback is correct.</w:t>
-      </w:r>
-    </w:p>
-    <w:p>
-      <w:pPr>
-        <w:pStyle w:val="Paragraph"/>
-        <w:rPr>
+        <w:t xml:space="preserve">Left </w:t>
+      </w:r>
+      <w:r>
+        <w:rPr>
+          <w:b/>
+          <w:bCs/>
           <w:i/>
           <w:iCs/>
         </w:rPr>
-      </w:pPr>
+        <w:t>- 09</w:t>
+      </w:r>
       <w:r>
         <w:rPr>
           <w:i/>
           <w:iCs/>
         </w:rPr>
+        <w:t>).</w:t>
+      </w:r>
+    </w:p>
+    <w:p>
+      <w:pPr>
+        <w:pStyle w:val="Header1"/>
+      </w:pPr>
+      <w:bookmarkStart w:id="0" w:name="_Toc168934051"/>
+      <w:r>
+        <w:t>Traffic pattern</w:t>
+      </w:r>
+      <w:bookmarkEnd w:id="0"/>
+    </w:p>
+    <w:p>
+      <w:pPr>
+        <w:pStyle w:val="Header2"/>
+      </w:pPr>
+      <w:bookmarkStart w:id="1" w:name="_Toc168934052"/>
+      <w:r>
+        <w:t>Ground procedures</w:t>
+      </w:r>
+      <w:bookmarkEnd w:id="1"/>
+    </w:p>
+    <w:p>
+      <w:pPr>
+        <w:pStyle w:val="Header3"/>
+      </w:pPr>
+      <w:bookmarkStart w:id="2" w:name="_Toc168934053"/>
+      <w:r>
+        <w:t>Departure clearance</w:t>
+      </w:r>
+      <w:bookmarkEnd w:id="2"/>
+    </w:p>
+    <w:p>
+      <w:pPr>
+        <w:pStyle w:val="Pilot"/>
+      </w:pPr>
+      <w:r>
+        <w:rPr>
+          <w:b/>
+          <w:bCs/>
+        </w:rPr>
+        <w:t>Pilot:</w:t>
+      </w:r>
+      <w:r>
+        <w:t xml:space="preserve"> Sofia Tower, LZBKGE with information </w:t>
+      </w:r>
+      <w:r>
+        <w:t>[ATIS_information]</w:t>
+      </w:r>
+      <w:r>
+        <w:t xml:space="preserve"> on board, requesting VFR flight for traffic circuits.</w:t>
+      </w:r>
+    </w:p>
+    <w:p>
+      <w:pPr>
+        <w:pStyle w:val="ATC"/>
+      </w:pPr>
+      <w:r>
+        <w:rPr>
+          <w:b/>
+          <w:bCs/>
+        </w:rPr>
+        <w:t>ATC:</w:t>
+      </w:r>
+      <w:r>
+        <w:t xml:space="preserve"> LZBKGE, cleared for [*] traffic pattern, runway [active_runway], not above altitude [pattern_altitude] feet, squawk [assigned_squawk]</w:t>
+      </w:r>
+    </w:p>
+    <w:p>
+      <w:pPr>
+        <w:pStyle w:val="Pilot"/>
+      </w:pPr>
+      <w:r>
+        <w:rPr>
+          <w:b/>
+          <w:bCs/>
+        </w:rPr>
+        <w:t>Pilot:</w:t>
+      </w:r>
+      <w:r>
+        <w:t xml:space="preserve"> Cleared for [*] traffic pattern, runway [active_runway], not above altitude [pattern_altitude], squawk [assigned_squawk], LZBKGE.</w:t>
+      </w:r>
+    </w:p>
+    <w:p>
+      <w:pPr>
+        <w:pStyle w:val="ATC"/>
+      </w:pPr>
+      <w:r>
+        <w:rPr>
+          <w:b/>
+          <w:bCs/>
+        </w:rPr>
+        <w:t>ATC</w:t>
+      </w:r>
+      <w:r>
+        <w:rPr>
+          <w:b/>
+          <w:bCs/>
+        </w:rPr>
+        <w:t>:</w:t>
+      </w:r>
+      <w:r>
+        <w:t xml:space="preserve"> LZBKGE, readback is correct.</w:t>
+      </w:r>
+    </w:p>
+    <w:p>
+      <w:pPr>
+        <w:pStyle w:val="Paragraph"/>
+        <w:rPr>
+          <w:i/>
+          <w:iCs/>
+        </w:rPr>
+      </w:pPr>
+      <w:r>
+        <w:rPr>
+          <w:i/>
+          <w:iCs/>
+        </w:rPr>
         <w:t>or</w:t>
       </w:r>
     </w:p>
@@ -2139,15 +2101,7 @@
         <w:t>ATC:</w:t>
       </w:r>
       <w:r>
-        <w:t xml:space="preserve"> LZBKGE, negative, [</w:t>
-      </w:r>
-      <w:proofErr w:type="spellStart"/>
-      <w:r>
-        <w:t>correct_callback</w:t>
-      </w:r>
-      <w:proofErr w:type="spellEnd"/>
-      <w:r>
-        <w:t>].</w:t>
+        <w:t xml:space="preserve"> LZBKGE, negative, [correct_callback].</w:t>
       </w:r>
     </w:p>
     <w:p>
@@ -2187,15 +2141,7 @@
         <w:t>ATC:</w:t>
       </w:r>
       <w:r>
-        <w:t xml:space="preserve"> LZBKGE, QNH [</w:t>
-      </w:r>
-      <w:proofErr w:type="spellStart"/>
-      <w:r>
-        <w:t>current_pressure</w:t>
-      </w:r>
-      <w:proofErr w:type="spellEnd"/>
-      <w:r>
-        <w:t>], startup is approved.</w:t>
+        <w:t xml:space="preserve"> LZBKGE, QNH [current_pressure], startup is approved.</w:t>
       </w:r>
     </w:p>
     <w:p>
@@ -2224,15 +2170,7 @@
         <w:t>Pilot:</w:t>
       </w:r>
       <w:r>
-        <w:t xml:space="preserve"> QNH [</w:t>
-      </w:r>
-      <w:proofErr w:type="spellStart"/>
-      <w:r>
-        <w:t>current_pressure</w:t>
-      </w:r>
-      <w:proofErr w:type="spellEnd"/>
-      <w:r>
-        <w:t>], startup approved, LZBKGE.</w:t>
+        <w:t xml:space="preserve"> QNH [current_pressure], startup approved, LZBKGE.</w:t>
       </w:r>
     </w:p>
     <w:p>
@@ -2273,15 +2211,7 @@
         <w:t>ATC:</w:t>
       </w:r>
       <w:r>
-        <w:t xml:space="preserve"> LZBKGE, taxi via [</w:t>
-      </w:r>
-      <w:proofErr w:type="spellStart"/>
-      <w:r>
-        <w:t>taxi_instructions</w:t>
-      </w:r>
-      <w:proofErr w:type="spellEnd"/>
-      <w:r>
-        <w:t>].</w:t>
+        <w:t xml:space="preserve"> LZBKGE, taxi via [taxi_instructions].</w:t>
       </w:r>
     </w:p>
     <w:p>
@@ -2296,15 +2226,7 @@
         <w:t>Pilot:</w:t>
       </w:r>
       <w:r>
-        <w:t xml:space="preserve"> Taxiing via [</w:t>
-      </w:r>
-      <w:proofErr w:type="spellStart"/>
-      <w:r>
-        <w:t>taxi_instructions</w:t>
-      </w:r>
-      <w:proofErr w:type="spellEnd"/>
-      <w:r>
-        <w:t>], LZBKGE.</w:t>
+        <w:t xml:space="preserve"> Taxiing via [taxi_instructions], LZBKGE.</w:t>
       </w:r>
     </w:p>
     <w:p>
@@ -2399,31 +2321,7 @@
         <w:t>ATC:</w:t>
       </w:r>
       <w:r>
-        <w:t xml:space="preserve"> LZBKGE, winds [</w:t>
-      </w:r>
-      <w:proofErr w:type="spellStart"/>
-      <w:r>
-        <w:t>current_winds</w:t>
-      </w:r>
-      <w:proofErr w:type="spellEnd"/>
-      <w:r>
-        <w:t>], runway [</w:t>
-      </w:r>
-      <w:proofErr w:type="spellStart"/>
-      <w:r>
-        <w:t>active_runway</w:t>
-      </w:r>
-      <w:proofErr w:type="spellEnd"/>
-      <w:r>
-        <w:t xml:space="preserve">], cleared for take-off. When </w:t>
-      </w:r>
-      <w:proofErr w:type="spellStart"/>
-      <w:r>
-        <w:t>airbourne</w:t>
-      </w:r>
-      <w:proofErr w:type="spellEnd"/>
-      <w:r>
-        <w:t xml:space="preserve"> remain of Tower frequency and report on downwind.</w:t>
+        <w:t xml:space="preserve"> LZBKGE, winds [current_winds], runway [active_runway], cleared for take-off. When airbourne remain of Tower frequency and report on downwind.</w:t>
       </w:r>
     </w:p>
     <w:p>
@@ -2438,23 +2336,7 @@
         <w:t>Pilot:</w:t>
       </w:r>
       <w:r>
-        <w:t xml:space="preserve"> Cleared for take-off, runway [</w:t>
-      </w:r>
-      <w:proofErr w:type="spellStart"/>
-      <w:r>
-        <w:t>active_runway</w:t>
-      </w:r>
-      <w:proofErr w:type="spellEnd"/>
-      <w:r>
-        <w:t xml:space="preserve">], when </w:t>
-      </w:r>
-      <w:proofErr w:type="spellStart"/>
-      <w:r>
-        <w:t>airbourne</w:t>
-      </w:r>
-      <w:proofErr w:type="spellEnd"/>
-      <w:r>
-        <w:t xml:space="preserve"> will remain on Tower frequency and will report on downwind, LZBKGE.</w:t>
+        <w:t xml:space="preserve"> Cleared for take-off, runway [active_runway], when airbourne will remain on Tower frequency and will report on downwind, LZBKGE.</w:t>
       </w:r>
     </w:p>
     <w:p>
@@ -2753,15 +2635,7 @@
         <w:t>Pilot:</w:t>
       </w:r>
       <w:r>
-        <w:t xml:space="preserve"> Sofia Tower, LZBKGE on base, turning final, runway [</w:t>
-      </w:r>
-      <w:proofErr w:type="spellStart"/>
-      <w:r>
-        <w:t>active_runway</w:t>
-      </w:r>
-      <w:proofErr w:type="spellEnd"/>
-      <w:r>
-        <w:t>].</w:t>
+        <w:t xml:space="preserve"> Sofia Tower, LZBKGE on base, turning final, runway [active_runway].</w:t>
       </w:r>
     </w:p>
     <w:p>
@@ -2779,23 +2653,7 @@
         <w:t>ATC:</w:t>
       </w:r>
       <w:r>
-        <w:t xml:space="preserve"> LZBKGE, wind [</w:t>
-      </w:r>
-      <w:proofErr w:type="spellStart"/>
-      <w:r>
-        <w:t>current_winds</w:t>
-      </w:r>
-      <w:proofErr w:type="spellEnd"/>
-      <w:r>
-        <w:t>], runway [</w:t>
-      </w:r>
-      <w:proofErr w:type="spellStart"/>
-      <w:r>
-        <w:t>active_runway</w:t>
-      </w:r>
-      <w:proofErr w:type="spellEnd"/>
-      <w:r>
-        <w:t>], cleared for Touch-and-Go, after Touch-and-Go, report on downwind.</w:t>
+        <w:t xml:space="preserve"> LZBKGE, wind [current_winds], runway [active_runway], cleared for Touch-and-Go, after Touch-and-Go, report on downwind.</w:t>
       </w:r>
     </w:p>
     <w:p>
@@ -2811,15 +2669,7 @@
         <w:t>Pilot:</w:t>
       </w:r>
       <w:r>
-        <w:t xml:space="preserve"> Cleared for Touch-and-Go, runway [</w:t>
-      </w:r>
-      <w:proofErr w:type="spellStart"/>
-      <w:r>
-        <w:t>active_runway</w:t>
-      </w:r>
-      <w:proofErr w:type="spellEnd"/>
-      <w:r>
-        <w:t>], after Touch-and-Go will report on downwind, LZBKGE.</w:t>
+        <w:t xml:space="preserve"> Cleared for Touch-and-Go, runway [active_runway], after Touch-and-Go will report on downwind, LZBKGE.</w:t>
       </w:r>
     </w:p>
     <w:p>
@@ -2923,15 +2773,7 @@
         <w:t>Pilot:</w:t>
       </w:r>
       <w:r>
-        <w:t xml:space="preserve"> Sofia Tower, LZBKGE on base, turning final, runway [</w:t>
-      </w:r>
-      <w:proofErr w:type="spellStart"/>
-      <w:r>
-        <w:t>active_runway</w:t>
-      </w:r>
-      <w:proofErr w:type="spellEnd"/>
-      <w:r>
-        <w:t>].</w:t>
+        <w:t xml:space="preserve"> Sofia Tower, LZBKGE on base, turning final, runway [active_runway].</w:t>
       </w:r>
     </w:p>
     <w:p>
@@ -2946,23 +2788,7 @@
         <w:t>ATC:</w:t>
       </w:r>
       <w:r>
-        <w:t xml:space="preserve"> LZBKGE, wind [</w:t>
-      </w:r>
-      <w:proofErr w:type="spellStart"/>
-      <w:r>
-        <w:t>current_winds</w:t>
-      </w:r>
-      <w:proofErr w:type="spellEnd"/>
-      <w:r>
-        <w:t>], runway [</w:t>
-      </w:r>
-      <w:proofErr w:type="spellStart"/>
-      <w:r>
-        <w:t>active_runway</w:t>
-      </w:r>
-      <w:proofErr w:type="spellEnd"/>
-      <w:r>
-        <w:t>], cleared for Lowpass, after Lowpass, report on downwind.</w:t>
+        <w:t xml:space="preserve"> LZBKGE, wind [current_winds], runway [active_runway], cleared for Lowpass, after Lowpass, report on downwind.</w:t>
       </w:r>
     </w:p>
     <w:p>
@@ -2977,15 +2803,7 @@
         <w:t>Pilot:</w:t>
       </w:r>
       <w:r>
-        <w:t xml:space="preserve"> Cleared for Lowpass, runway [</w:t>
-      </w:r>
-      <w:proofErr w:type="spellStart"/>
-      <w:r>
-        <w:t>active_runway</w:t>
-      </w:r>
-      <w:proofErr w:type="spellEnd"/>
-      <w:r>
-        <w:t>], after Lowpass will report on downwind, LZBKGE.</w:t>
+        <w:t xml:space="preserve"> Cleared for Lowpass, runway [active_runway], after Lowpass will report on downwind, LZBKGE.</w:t>
       </w:r>
     </w:p>
     <w:p>
@@ -3100,15 +2918,7 @@
         <w:t>Pilot:</w:t>
       </w:r>
       <w:r>
-        <w:t xml:space="preserve"> Sofia Tower, LZBKGE on base, turning final, runway [</w:t>
-      </w:r>
-      <w:proofErr w:type="spellStart"/>
-      <w:r>
-        <w:t>active_runway</w:t>
-      </w:r>
-      <w:proofErr w:type="spellEnd"/>
-      <w:r>
-        <w:t>].</w:t>
+        <w:t xml:space="preserve"> Sofia Tower, LZBKGE on base, turning final, runway [active_runway].</w:t>
       </w:r>
     </w:p>
     <w:p>
@@ -3123,23 +2933,7 @@
         <w:t>ATC:</w:t>
       </w:r>
       <w:r>
-        <w:t xml:space="preserve"> LZBKGE, wind [</w:t>
-      </w:r>
-      <w:proofErr w:type="spellStart"/>
-      <w:r>
-        <w:t>current_winds</w:t>
-      </w:r>
-      <w:proofErr w:type="spellEnd"/>
-      <w:r>
-        <w:t>], runway [</w:t>
-      </w:r>
-      <w:proofErr w:type="spellStart"/>
-      <w:r>
-        <w:t>active_runway</w:t>
-      </w:r>
-      <w:proofErr w:type="spellEnd"/>
-      <w:r>
-        <w:t>], cleared to land.</w:t>
+        <w:t xml:space="preserve"> LZBKGE, wind [current_winds], runway [active_runway], cleared to land.</w:t>
       </w:r>
     </w:p>
     <w:p>
@@ -3154,15 +2948,7 @@
         <w:t>Pilot:</w:t>
       </w:r>
       <w:r>
-        <w:t xml:space="preserve"> Cleared to land, runway [</w:t>
-      </w:r>
-      <w:proofErr w:type="spellStart"/>
-      <w:r>
-        <w:t>active_runway</w:t>
-      </w:r>
-      <w:proofErr w:type="spellEnd"/>
-      <w:r>
-        <w:t>], LZBKGE.</w:t>
+        <w:t xml:space="preserve"> Cleared to land, runway [active_runway], LZBKGE.</w:t>
       </w:r>
     </w:p>
     <w:p>
@@ -3263,15 +3049,7 @@
         <w:t>Pilot:</w:t>
       </w:r>
       <w:r>
-        <w:t xml:space="preserve"> Sofia Tower, LZBKGE with information [</w:t>
-      </w:r>
-      <w:proofErr w:type="spellStart"/>
-      <w:r>
-        <w:t>ATIS_information</w:t>
-      </w:r>
-      <w:proofErr w:type="spellEnd"/>
-      <w:r>
-        <w:t>] on board, requesting VFR flight to [destination].</w:t>
+        <w:t xml:space="preserve"> Sofia Tower, LZBKGE with information [ATIS_information] on board, requesting VFR flight to [destination].</w:t>
       </w:r>
     </w:p>
     <w:p>
@@ -3286,31 +3064,7 @@
         <w:t>ATC:</w:t>
       </w:r>
       <w:r>
-        <w:t xml:space="preserve"> LZBKGE, cleared VFR to [destination], after departure runway [</w:t>
-      </w:r>
-      <w:proofErr w:type="spellStart"/>
-      <w:r>
-        <w:t>active_runway</w:t>
-      </w:r>
-      <w:proofErr w:type="spellEnd"/>
-      <w:r>
-        <w:t>], turn [**] to [initial VFR point] then as filed, not above altitude [</w:t>
-      </w:r>
-      <w:proofErr w:type="spellStart"/>
-      <w:r>
-        <w:t>max_altitude_within_airport_cta</w:t>
-      </w:r>
-      <w:proofErr w:type="spellEnd"/>
-      <w:r>
-        <w:t>], squawk [</w:t>
-      </w:r>
-      <w:proofErr w:type="spellStart"/>
-      <w:r>
-        <w:t>assigned_squawk</w:t>
-      </w:r>
-      <w:proofErr w:type="spellEnd"/>
-      <w:r>
-        <w:t>].</w:t>
+        <w:t xml:space="preserve"> LZBKGE, cleared VFR to [destination], after departure runway [active_runway], turn [**] to [initial VFR point] then as filed, not above altitude [max_altitude_within_airport_cta], squawk [assigned_squawk].</w:t>
       </w:r>
     </w:p>
     <w:p>
@@ -3325,47 +3079,7 @@
         <w:t>Pilot</w:t>
       </w:r>
       <w:r>
-        <w:t xml:space="preserve">: Cleared VFR to [destination], after </w:t>
-      </w:r>
-      <w:proofErr w:type="spellStart"/>
-      <w:r>
-        <w:t>depature</w:t>
-      </w:r>
-      <w:proofErr w:type="spellEnd"/>
-      <w:r>
-        <w:t xml:space="preserve"> runway [</w:t>
-      </w:r>
-      <w:proofErr w:type="spellStart"/>
-      <w:r>
-        <w:t>active_runway</w:t>
-      </w:r>
-      <w:proofErr w:type="spellEnd"/>
-      <w:r>
-        <w:t>], turn [**] to [</w:t>
-      </w:r>
-      <w:proofErr w:type="spellStart"/>
-      <w:r>
-        <w:t>initial_vfr_point</w:t>
-      </w:r>
-      <w:proofErr w:type="spellEnd"/>
-      <w:r>
-        <w:t>] then as filed, not above altitude [</w:t>
-      </w:r>
-      <w:proofErr w:type="spellStart"/>
-      <w:r>
-        <w:t>max_altitude_within_airport_cta</w:t>
-      </w:r>
-      <w:proofErr w:type="spellEnd"/>
-      <w:r>
-        <w:t>], squawk [</w:t>
-      </w:r>
-      <w:proofErr w:type="spellStart"/>
-      <w:r>
-        <w:t>assigned_squawk</w:t>
-      </w:r>
-      <w:proofErr w:type="spellEnd"/>
-      <w:r>
-        <w:t>], LZBKGE.</w:t>
+        <w:t>: Cleared VFR to [destination], after depature runway [active_runway], turn [**] to [initial_vfr_point] then as filed, not above altitude [max_altitude_within_airport_cta], squawk [assigned_squawk], LZBKGE.</w:t>
       </w:r>
     </w:p>
     <w:p>
@@ -3420,15 +3134,7 @@
         <w:t>ATC:</w:t>
       </w:r>
       <w:r>
-        <w:t xml:space="preserve"> LZBKGE, QNH [</w:t>
-      </w:r>
-      <w:proofErr w:type="spellStart"/>
-      <w:r>
-        <w:t>current_pressure</w:t>
-      </w:r>
-      <w:proofErr w:type="spellEnd"/>
-      <w:r>
-        <w:t>], startup is approved.</w:t>
+        <w:t xml:space="preserve"> LZBKGE, QNH [current_pressure], startup is approved.</w:t>
       </w:r>
     </w:p>
     <w:p>
@@ -3457,15 +3163,7 @@
         <w:t>Pilot:</w:t>
       </w:r>
       <w:r>
-        <w:t xml:space="preserve"> QNH [</w:t>
-      </w:r>
-      <w:proofErr w:type="spellStart"/>
-      <w:r>
-        <w:t>current_pressure</w:t>
-      </w:r>
-      <w:proofErr w:type="spellEnd"/>
-      <w:r>
-        <w:t>], startup approved, LZBKGE.</w:t>
+        <w:t xml:space="preserve"> QNH [current_pressure], startup approved, LZBKGE.</w:t>
       </w:r>
     </w:p>
     <w:p>
@@ -3505,15 +3203,7 @@
         <w:t>ATC:</w:t>
       </w:r>
       <w:r>
-        <w:t xml:space="preserve"> LZBKGE, taxi via [</w:t>
-      </w:r>
-      <w:proofErr w:type="spellStart"/>
-      <w:r>
-        <w:t>taxi_instructions</w:t>
-      </w:r>
-      <w:proofErr w:type="spellEnd"/>
-      <w:r>
-        <w:t>].</w:t>
+        <w:t xml:space="preserve"> LZBKGE, taxi via [taxi_instructions].</w:t>
       </w:r>
     </w:p>
     <w:p>
@@ -3528,15 +3218,7 @@
         <w:t>Pilot:</w:t>
       </w:r>
       <w:r>
-        <w:t xml:space="preserve"> Taxiing via [</w:t>
-      </w:r>
-      <w:proofErr w:type="spellStart"/>
-      <w:r>
-        <w:t>taxi_instructions</w:t>
-      </w:r>
-      <w:proofErr w:type="spellEnd"/>
-      <w:r>
-        <w:t>], LZBKGE.</w:t>
+        <w:t xml:space="preserve"> Taxiing via [taxi_instructions], LZBKGE.</w:t>
       </w:r>
     </w:p>
     <w:p>
@@ -3610,39 +3292,7 @@
         <w:t>ATC:</w:t>
       </w:r>
       <w:r>
-        <w:t xml:space="preserve"> LZBKGE, winds [</w:t>
-      </w:r>
-      <w:proofErr w:type="spellStart"/>
-      <w:r>
-        <w:t>current_winds</w:t>
-      </w:r>
-      <w:proofErr w:type="spellEnd"/>
-      <w:r>
-        <w:t>], runway [</w:t>
-      </w:r>
-      <w:proofErr w:type="spellStart"/>
-      <w:r>
-        <w:t>active_runway</w:t>
-      </w:r>
-      <w:proofErr w:type="spellEnd"/>
-      <w:r>
-        <w:t xml:space="preserve">], cleared for take-off. When </w:t>
-      </w:r>
-      <w:proofErr w:type="spellStart"/>
-      <w:r>
-        <w:t>airbourne</w:t>
-      </w:r>
-      <w:proofErr w:type="spellEnd"/>
-      <w:r>
-        <w:t xml:space="preserve"> remain on Tower frequency and report passing [</w:t>
-      </w:r>
-      <w:proofErr w:type="spellStart"/>
-      <w:r>
-        <w:t>initial_vfr_point</w:t>
-      </w:r>
-      <w:proofErr w:type="spellEnd"/>
-      <w:r>
-        <w:t>].</w:t>
+        <w:t xml:space="preserve"> LZBKGE, winds [current_winds], runway [active_runway], cleared for take-off. When airbourne remain on Tower frequency and report passing [initial_vfr_point].</w:t>
       </w:r>
     </w:p>
     <w:p>
@@ -3660,31 +3310,7 @@
         <w:t xml:space="preserve"> </w:t>
       </w:r>
       <w:r>
-        <w:t>Cleared for take-off, runway [</w:t>
-      </w:r>
-      <w:proofErr w:type="spellStart"/>
-      <w:r>
-        <w:t>active_runway</w:t>
-      </w:r>
-      <w:proofErr w:type="spellEnd"/>
-      <w:r>
-        <w:t xml:space="preserve">], when </w:t>
-      </w:r>
-      <w:proofErr w:type="spellStart"/>
-      <w:r>
-        <w:t>airbourne</w:t>
-      </w:r>
-      <w:proofErr w:type="spellEnd"/>
-      <w:r>
-        <w:t xml:space="preserve"> will remain on Tower frequency and will report passing [</w:t>
-      </w:r>
-      <w:proofErr w:type="spellStart"/>
-      <w:r>
-        <w:t>initial_vfr_point</w:t>
-      </w:r>
-      <w:proofErr w:type="spellEnd"/>
-      <w:r>
-        <w:t>], LZBKGE.</w:t>
+        <w:t>Cleared for take-off, runway [active_runway], when airbourne will remain on Tower frequency and will report passing [initial_vfr_point], LZBKGE.</w:t>
       </w:r>
     </w:p>
     <w:p>
@@ -3707,15 +3333,7 @@
         <w:t>Pilot:</w:t>
       </w:r>
       <w:r>
-        <w:t xml:space="preserve"> Sofia Tower, LZBKGE report passing [</w:t>
-      </w:r>
-      <w:proofErr w:type="spellStart"/>
-      <w:r>
-        <w:t>initial_vfr_point</w:t>
-      </w:r>
-      <w:proofErr w:type="spellEnd"/>
-      <w:r>
-        <w:t>].</w:t>
+        <w:t xml:space="preserve"> Sofia Tower, LZBKGE report passing [initial_vfr_point].</w:t>
       </w:r>
     </w:p>
     <w:p>
@@ -3836,23 +3454,7 @@
         <w:t>Pilot:</w:t>
       </w:r>
       <w:r>
-        <w:t xml:space="preserve"> Sofia Tower, LZBKGE with information [</w:t>
-      </w:r>
-      <w:proofErr w:type="spellStart"/>
-      <w:r>
-        <w:t>ATIS_information</w:t>
-      </w:r>
-      <w:proofErr w:type="spellEnd"/>
-      <w:r>
-        <w:t>] on board, requesting leaving the Sofia control zone, via [</w:t>
-      </w:r>
-      <w:proofErr w:type="spellStart"/>
-      <w:r>
-        <w:t>cta_exit_waypoint</w:t>
-      </w:r>
-      <w:proofErr w:type="spellEnd"/>
-      <w:r>
-        <w:t>].</w:t>
+        <w:t xml:space="preserve"> Sofia Tower, LZBKGE with information [ATIS_information] on board, requesting leaving the Sofia control zone, via [cta_exit_waypoint].</w:t>
       </w:r>
     </w:p>
     <w:p>
@@ -3860,15 +3462,7 @@
         <w:pStyle w:val="Note"/>
       </w:pPr>
       <w:r>
-        <w:t>Note: [</w:t>
-      </w:r>
-      <w:proofErr w:type="spellStart"/>
-      <w:r>
-        <w:t>cta_exit_waypoint</w:t>
-      </w:r>
-      <w:proofErr w:type="spellEnd"/>
-      <w:r>
-        <w:t>] - for example ADBIL to the north-east, or XUDLA to the south-east and so on)</w:t>
+        <w:t>Note: [cta_exit_waypoint] - for example ADBIL to the north-east, or XUDLA to the south-east and so on)</w:t>
       </w:r>
     </w:p>
     <w:p>
@@ -3883,31 +3477,7 @@
         <w:t>ATC:</w:t>
       </w:r>
       <w:r>
-        <w:t xml:space="preserve"> LZBKGE, cleared exit the Sofia control zone via [airway], after departure runway [</w:t>
-      </w:r>
-      <w:proofErr w:type="spellStart"/>
-      <w:r>
-        <w:t>active_runway</w:t>
-      </w:r>
-      <w:proofErr w:type="spellEnd"/>
-      <w:r>
-        <w:t>], turn [**] to [initial VFR point] then as filed, not above altitude [</w:t>
-      </w:r>
-      <w:proofErr w:type="spellStart"/>
-      <w:r>
-        <w:t>max_altitude_within_airport_cta</w:t>
-      </w:r>
-      <w:proofErr w:type="spellEnd"/>
-      <w:r>
-        <w:t>], squawk [</w:t>
-      </w:r>
-      <w:proofErr w:type="spellStart"/>
-      <w:r>
-        <w:t>assigned_squawk</w:t>
-      </w:r>
-      <w:proofErr w:type="spellEnd"/>
-      <w:r>
-        <w:t>].</w:t>
+        <w:t xml:space="preserve"> LZBKGE, cleared exit the Sofia control zone via [airway], after departure runway [active_runway], turn [**] to [initial VFR point] then as filed, not above altitude [max_altitude_within_airport_cta], squawk [assigned_squawk].</w:t>
       </w:r>
     </w:p>
     <w:p>
@@ -3936,47 +3506,7 @@
         <w:t>Pilot:</w:t>
       </w:r>
       <w:r>
-        <w:t xml:space="preserve"> Cleared to exit the Sofia control zone via [airway], after </w:t>
-      </w:r>
-      <w:proofErr w:type="spellStart"/>
-      <w:r>
-        <w:t>depature</w:t>
-      </w:r>
-      <w:proofErr w:type="spellEnd"/>
-      <w:r>
-        <w:t xml:space="preserve"> runway [</w:t>
-      </w:r>
-      <w:proofErr w:type="spellStart"/>
-      <w:r>
-        <w:t>active_runway</w:t>
-      </w:r>
-      <w:proofErr w:type="spellEnd"/>
-      <w:r>
-        <w:t>], turn [**] to [</w:t>
-      </w:r>
-      <w:proofErr w:type="spellStart"/>
-      <w:r>
-        <w:t>initial_vfr_point</w:t>
-      </w:r>
-      <w:proofErr w:type="spellEnd"/>
-      <w:r>
-        <w:t>] then as filed, not above altitude [</w:t>
-      </w:r>
-      <w:proofErr w:type="spellStart"/>
-      <w:r>
-        <w:t>max_altitude_within_airport_cta</w:t>
-      </w:r>
-      <w:proofErr w:type="spellEnd"/>
-      <w:r>
-        <w:t>], squawk [</w:t>
-      </w:r>
-      <w:proofErr w:type="spellStart"/>
-      <w:r>
-        <w:t>assigned_squawk</w:t>
-      </w:r>
-      <w:proofErr w:type="spellEnd"/>
-      <w:r>
-        <w:t>], LZBKGE.</w:t>
+        <w:t xml:space="preserve"> Cleared to exit the Sofia control zone via [airway], after depature runway [active_runway], turn [**] to [initial_vfr_point] then as filed, not above altitude [max_altitude_within_airport_cta], squawk [assigned_squawk], LZBKGE.</w:t>
       </w:r>
     </w:p>
     <w:p>
@@ -4219,15 +3749,7 @@
         <w:t>ATC:</w:t>
       </w:r>
       <w:r>
-        <w:t xml:space="preserve"> LZBKGE, winds [winds], runway [</w:t>
-      </w:r>
-      <w:proofErr w:type="spellStart"/>
-      <w:r>
-        <w:t>active_runway</w:t>
-      </w:r>
-      <w:proofErr w:type="spellEnd"/>
-      <w:r>
-        <w:t>] cleared to land.</w:t>
+        <w:t xml:space="preserve"> LZBKGE, winds [winds], runway [active_runway] cleared to land.</w:t>
       </w:r>
     </w:p>
     <w:p>
@@ -4296,15 +3818,7 @@
       <w:pStyle w:val="Footer"/>
     </w:pPr>
     <w:r>
-      <w:t xml:space="preserve">Atanas Y. </w:t>
-    </w:r>
-    <w:proofErr w:type="spellStart"/>
-    <w:r>
-      <w:t>Arshinkov</w:t>
-    </w:r>
-    <w:proofErr w:type="spellEnd"/>
-    <w:r>
-      <w:t>, 2024</w:t>
+      <w:t>Atanas Y. Arshinkov, 2024</w:t>
     </w:r>
     <w:r>
       <w:tab/>

</xml_diff>